<commit_message>
Desenha a Seção 6 do Documento de Requisitos do Frila (T-0024)
Cria 07 - Arquitetura com a modelagem de banco, o diagrama de classe e o
diagrama de arquitetura, preenchendo as Seções 6.2, 6.3 e 6.4, que traziam
as tabelas descritivas mas nenhum desenho. Serve de insumo técnico para
T-0012, a quem cabe a curadoria e a padronização visual.

Os diagramas nascem de blocos Mermaid nas próprias notas e viram PNG por
scripts/mermaid-export.js: o site e o app escapam Mermaid como código, e um
diagrama que só renderiza no Obsidian é ilegível para mentor e avaliador.

Acrescenta os tipos documento-produto e arquitetura ao vault. Os sete
documentos de produto copiados do Frila estavam sem frontmatter e reprovavam
bancada-indice --verificar desde 15/09, o que impedia o site de republicar.

Co-Authored-By: Claude Opus 5 <noreply@anthropic.com>
</commit_message>
<xml_diff>
--- a/doc-harness/01 - CBL/Desafios/C18/Documentos de Produto/Frila_Documento_de_Requisitos.docx
+++ b/doc-harness/01 - CBL/Desafios/C18/Documentos de Produto/Frila_Documento_de_Requisitos.docx
@@ -1,6 +1,6 @@
 
 <file path=word/document.xml><?xml version="1.0" encoding="utf-8"?>
-<w:document xmlns:w="http://schemas.openxmlformats.org/wordprocessingml/2006/main" xmlns:r="http://schemas.openxmlformats.org/officeDocument/2006/relationships">
+<w:document xmlns:w="http://schemas.openxmlformats.org/wordprocessingml/2006/main" xmlns:r="http://schemas.openxmlformats.org/officeDocument/2006/relationships" xmlns:wp="http://schemas.openxmlformats.org/drawingml/2006/wordprocessingDrawing" xmlns:a="http://schemas.openxmlformats.org/drawingml/2006/main" xmlns:pic="http://schemas.openxmlformats.org/drawingml/2006/picture">
   <w:body>
     <w:p>
       <w:pPr>
@@ -19326,73 +19326,129 @@
         <w:t xml:space="preserve">6.2 Diagrama de Banco de Dados (DER)</w:t>
       </w:r>
     </w:p>
-    <w:tbl>
-      <w:tblPr>
-        <w:tblW w:w="9360" w:type="dxa"/>
-        <w:tblLayout w:type="fixed"/>
-        <w:tblBorders>
-          <w:top w:val="single" w:sz="4" w:space="0" w:color="D9D9D9"/>
-          <w:left w:val="single" w:sz="4" w:space="0" w:color="D9D9D9"/>
-          <w:bottom w:val="single" w:sz="4" w:space="0" w:color="D9D9D9"/>
-          <w:right w:val="single" w:sz="4" w:space="0" w:color="D9D9D9"/>
-          <w:insideH w:val="single" w:sz="4" w:space="0" w:color="D9D9D9"/>
-          <w:insideV w:val="single" w:sz="4" w:space="0" w:color="D9D9D9"/>
-        </w:tblBorders>
-      </w:tblPr>
-      <w:tblGrid>
-        <w:gridCol w:w="9360"/>
-      </w:tblGrid>
-      <w:tr>
-        <w:tc>
-          <w:tcPr>
-            <w:tcW w:w="9360" w:type="dxa"/>
-            <w:vAlign w:val="top"/>
-            <w:tcMar>
-              <w:top w:w="90" w:type="dxa"/>
-              <w:left w:w="120" w:type="dxa"/>
-              <w:bottom w:w="90" w:type="dxa"/>
-              <w:right w:w="120" w:type="dxa"/>
-            </w:tcMar>
-          </w:tcPr>
-          <w:p>
-            <w:pPr>
-              <w:jc w:val="center"/>
-              <w:spacing w:before="0" w:after="40" w:line="264" w:lineRule="auto"/>
-            </w:pPr>
-            <w:r>
-              <w:rPr>
-                <w:rFonts w:ascii="SF Pro Display" w:hAnsi="SF Pro Display" w:cs="SF Pro Display"/>
-                <w:b/>
-                <w:color w:val="8C8C8C"/>
-                <w:sz w:val="22"/>
-                <w:szCs w:val="22"/>
-              </w:rPr>
-              <w:t xml:space="preserve">Diagrama Entidade-Relacionamento (DER)</w:t>
-            </w:r>
-          </w:p>
-          <w:p>
-            <w:pPr>
-              <w:jc w:val="center"/>
-              <w:spacing w:before="0" w:after="0" w:line="264" w:lineRule="auto"/>
-            </w:pPr>
-            <w:r>
-              <w:rPr>
-                <w:rFonts w:ascii="SF Pro Display" w:hAnsi="SF Pro Display" w:cs="SF Pro Display"/>
-                <w:i/>
-                <w:color w:val="8C8C8C"/>
-                <w:sz w:val="18"/>
-                <w:szCs w:val="18"/>
-              </w:rPr>
-              <w:t xml:space="preserve">Inserir o diagrama aqui. As entidades principais e seus relacionamentos estão descritos na tabela abaixo.</w:t>
-            </w:r>
-          </w:p>
-        </w:tc>
-      </w:tr>
-    </w:tbl>
     <w:p>
       <w:pPr>
-        <w:spacing w:before="0" w:after="0" w:line="264" w:lineRule="auto"/>
+        <w:spacing w:before="0" w:after="100" w:line="264" w:lineRule="auto"/>
       </w:pPr>
+      <w:r>
+        <w:rPr>
+          <w:rFonts w:ascii="SF Pro Display" w:hAnsi="SF Pro Display" w:cs="SF Pro Display"/>
+          <w:color w:val="1A1A1A"/>
+          <w:sz w:val="22"/>
+          <w:szCs w:val="22"/>
+        </w:rPr>
+        <w:t xml:space="preserve">O eixo do modelo é uma cadeia só — vaga → posição → turno → avaliação —, o ciclo de vida de uma unidade de trabalho da publicação à reputação. Despacho e candidatura penduram-se nela como o registro de quem foi chamado e quem respondeu. As duas vistas abaixo são do mesmo esquema: separá-las evita o emaranhado de linhas que um único desenho com dezesseis entidades produz.</w:t>
+      </w:r>
+    </w:p>
+    <w:p>
+      <w:pPr>
+        <w:jc w:val="center"/>
+        <w:spacing w:before="0" w:after="40" w:line="264" w:lineRule="auto"/>
+      </w:pPr>
+      <w:r>
+        <w:drawing>
+          <wp:inline distT="0" distB="0" distL="0" distR="0">
+            <wp:extent cx="5943600" cy="6656832"/>
+            <wp:docPr id="1" name="Imagem 1" descr="Figura 1 — O ciclo de uma vaga: da publicação à avaliação"/>
+            <a:graphic>
+              <a:graphicData uri="http://schemas.openxmlformats.org/drawingml/2006/picture">
+                <pic:pic>
+                  <pic:nvPicPr>
+                    <pic:cNvPr id="1" name="imagem1.png"/>
+                    <pic:cNvPicPr/>
+                  </pic:nvPicPr>
+                  <pic:blipFill>
+                    <a:blip r:embed="rIdImg1"/>
+                    <a:stretch>
+                      <a:fillRect/>
+                    </a:stretch>
+                  </pic:blipFill>
+                  <pic:spPr>
+                    <a:xfrm>
+                      <a:off x="0" y="0"/>
+                      <a:ext cx="5943600" cy="6656832"/>
+                    </a:xfrm>
+                    <a:prstGeom prst="rect">
+                      <a:avLst/>
+                    </a:prstGeom>
+                  </pic:spPr>
+                </pic:pic>
+              </a:graphicData>
+            </a:graphic>
+          </wp:inline>
+        </w:drawing>
+      </w:r>
+    </w:p>
+    <w:p>
+      <w:pPr>
+        <w:jc w:val="center"/>
+        <w:spacing w:before="0" w:after="240" w:line="264" w:lineRule="auto"/>
+      </w:pPr>
+      <w:r>
+        <w:rPr>
+          <w:rFonts w:ascii="SF Pro Display" w:hAnsi="SF Pro Display" w:cs="SF Pro Display"/>
+          <w:i/>
+          <w:color w:val="8C8C8C"/>
+          <w:sz w:val="18"/>
+          <w:szCs w:val="18"/>
+        </w:rPr>
+        <w:t xml:space="preserve">Figura 1 — O ciclo de uma vaga: da publicação à avaliação</w:t>
+      </w:r>
+    </w:p>
+    <w:p>
+      <w:pPr>
+        <w:jc w:val="center"/>
+        <w:spacing w:before="0" w:after="40" w:line="264" w:lineRule="auto"/>
+      </w:pPr>
+      <w:r>
+        <w:drawing>
+          <wp:inline distT="0" distB="0" distL="0" distR="0">
+            <wp:extent cx="5943600" cy="1743658"/>
+            <wp:docPr id="2" name="Imagem 2" descr="Figura 2 — Identidade, catálogo e histórico"/>
+            <a:graphic>
+              <a:graphicData uri="http://schemas.openxmlformats.org/drawingml/2006/picture">
+                <pic:pic>
+                  <pic:nvPicPr>
+                    <pic:cNvPr id="2" name="imagem2.png"/>
+                    <pic:cNvPicPr/>
+                  </pic:nvPicPr>
+                  <pic:blipFill>
+                    <a:blip r:embed="rIdImg2"/>
+                    <a:stretch>
+                      <a:fillRect/>
+                    </a:stretch>
+                  </pic:blipFill>
+                  <pic:spPr>
+                    <a:xfrm>
+                      <a:off x="0" y="0"/>
+                      <a:ext cx="5943600" cy="1743658"/>
+                    </a:xfrm>
+                    <a:prstGeom prst="rect">
+                      <a:avLst/>
+                    </a:prstGeom>
+                  </pic:spPr>
+                </pic:pic>
+              </a:graphicData>
+            </a:graphic>
+          </wp:inline>
+        </w:drawing>
+      </w:r>
+    </w:p>
+    <w:p>
+      <w:pPr>
+        <w:jc w:val="center"/>
+        <w:spacing w:before="0" w:after="240" w:line="264" w:lineRule="auto"/>
+      </w:pPr>
+      <w:r>
+        <w:rPr>
+          <w:rFonts w:ascii="SF Pro Display" w:hAnsi="SF Pro Display" w:cs="SF Pro Display"/>
+          <w:i/>
+          <w:color w:val="8C8C8C"/>
+          <w:sz w:val="18"/>
+          <w:szCs w:val="18"/>
+        </w:rPr>
+        <w:t xml:space="preserve">Figura 2 — Identidade, catálogo e histórico</w:t>
+      </w:r>
     </w:p>
     <w:p>
       <w:pPr>
@@ -21328,73 +21384,239 @@
         <w:t xml:space="preserve">6.3 Diagrama de Classes</w:t>
       </w:r>
     </w:p>
-    <w:tbl>
-      <w:tblPr>
-        <w:tblW w:w="9360" w:type="dxa"/>
-        <w:tblLayout w:type="fixed"/>
-        <w:tblBorders>
-          <w:top w:val="single" w:sz="4" w:space="0" w:color="D9D9D9"/>
-          <w:left w:val="single" w:sz="4" w:space="0" w:color="D9D9D9"/>
-          <w:bottom w:val="single" w:sz="4" w:space="0" w:color="D9D9D9"/>
-          <w:right w:val="single" w:sz="4" w:space="0" w:color="D9D9D9"/>
-          <w:insideH w:val="single" w:sz="4" w:space="0" w:color="D9D9D9"/>
-          <w:insideV w:val="single" w:sz="4" w:space="0" w:color="D9D9D9"/>
-        </w:tblBorders>
-      </w:tblPr>
-      <w:tblGrid>
-        <w:gridCol w:w="9360"/>
-      </w:tblGrid>
-      <w:tr>
-        <w:tc>
-          <w:tcPr>
-            <w:tcW w:w="9360" w:type="dxa"/>
-            <w:vAlign w:val="top"/>
-            <w:tcMar>
-              <w:top w:w="90" w:type="dxa"/>
-              <w:left w:w="120" w:type="dxa"/>
-              <w:bottom w:w="90" w:type="dxa"/>
-              <w:right w:w="120" w:type="dxa"/>
-            </w:tcMar>
-          </w:tcPr>
-          <w:p>
-            <w:pPr>
-              <w:jc w:val="center"/>
-              <w:spacing w:before="0" w:after="40" w:line="264" w:lineRule="auto"/>
-            </w:pPr>
-            <w:r>
-              <w:rPr>
-                <w:rFonts w:ascii="SF Pro Display" w:hAnsi="SF Pro Display" w:cs="SF Pro Display"/>
-                <w:b/>
-                <w:color w:val="8C8C8C"/>
-                <w:sz w:val="22"/>
-                <w:szCs w:val="22"/>
-              </w:rPr>
-              <w:t xml:space="preserve">Diagrama de Classes</w:t>
-            </w:r>
-          </w:p>
-          <w:p>
-            <w:pPr>
-              <w:jc w:val="center"/>
-              <w:spacing w:before="0" w:after="0" w:line="264" w:lineRule="auto"/>
-            </w:pPr>
-            <w:r>
-              <w:rPr>
-                <w:rFonts w:ascii="SF Pro Display" w:hAnsi="SF Pro Display" w:cs="SF Pro Display"/>
-                <w:i/>
-                <w:color w:val="8C8C8C"/>
-                <w:sz w:val="18"/>
-                <w:szCs w:val="18"/>
-              </w:rPr>
-              <w:t xml:space="preserve">Inserir o diagrama aqui. As classes mais relevantes e suas responsabilidades estão descritas na tabela abaixo.</w:t>
-            </w:r>
-          </w:p>
-        </w:tc>
-      </w:tr>
-    </w:tbl>
     <w:p>
       <w:pPr>
-        <w:spacing w:before="0" w:after="0" w:line="264" w:lineRule="auto"/>
+        <w:spacing w:before="0" w:after="100" w:line="264" w:lineRule="auto"/>
       </w:pPr>
+      <w:r>
+        <w:rPr>
+          <w:rFonts w:ascii="SF Pro Display" w:hAnsi="SF Pro Display" w:cs="SF Pro Display"/>
+          <w:color w:val="1A1A1A"/>
+          <w:sz w:val="22"/>
+          <w:szCs w:val="22"/>
+        </w:rPr>
+        <w:t xml:space="preserve">A regra de dependência vale em toda seta: o domínio é alvo de todas e origem de nenhuma. Quando precisa falar com o mundo, declara um protocolo e espera que alguém o implemente — é o que permite testar despacho, elegibilidade e reputação sem rede, sem interface e sem simulador.</w:t>
+      </w:r>
+    </w:p>
+    <w:p>
+      <w:pPr>
+        <w:jc w:val="center"/>
+        <w:spacing w:before="0" w:after="40" w:line="264" w:lineRule="auto"/>
+      </w:pPr>
+      <w:r>
+        <w:drawing>
+          <wp:inline distT="0" distB="0" distL="0" distR="0">
+            <wp:extent cx="5943600" cy="818761"/>
+            <wp:docPr id="3" name="Imagem 3" descr="Figura 3 — A regra de dependência entre as camadas"/>
+            <a:graphic>
+              <a:graphicData uri="http://schemas.openxmlformats.org/drawingml/2006/picture">
+                <pic:pic>
+                  <pic:nvPicPr>
+                    <pic:cNvPr id="3" name="imagem3.png"/>
+                    <pic:cNvPicPr/>
+                  </pic:nvPicPr>
+                  <pic:blipFill>
+                    <a:blip r:embed="rIdImg3"/>
+                    <a:stretch>
+                      <a:fillRect/>
+                    </a:stretch>
+                  </pic:blipFill>
+                  <pic:spPr>
+                    <a:xfrm>
+                      <a:off x="0" y="0"/>
+                      <a:ext cx="5943600" cy="818761"/>
+                    </a:xfrm>
+                    <a:prstGeom prst="rect">
+                      <a:avLst/>
+                    </a:prstGeom>
+                  </pic:spPr>
+                </pic:pic>
+              </a:graphicData>
+            </a:graphic>
+          </wp:inline>
+        </w:drawing>
+      </w:r>
+    </w:p>
+    <w:p>
+      <w:pPr>
+        <w:jc w:val="center"/>
+        <w:spacing w:before="0" w:after="240" w:line="264" w:lineRule="auto"/>
+      </w:pPr>
+      <w:r>
+        <w:rPr>
+          <w:rFonts w:ascii="SF Pro Display" w:hAnsi="SF Pro Display" w:cs="SF Pro Display"/>
+          <w:i/>
+          <w:color w:val="8C8C8C"/>
+          <w:sz w:val="18"/>
+          <w:szCs w:val="18"/>
+        </w:rPr>
+        <w:t xml:space="preserve">Figura 3 — A regra de dependência entre as camadas</w:t>
+      </w:r>
+    </w:p>
+    <w:p>
+      <w:pPr>
+        <w:jc w:val="center"/>
+        <w:spacing w:before="0" w:after="40" w:line="264" w:lineRule="auto"/>
+      </w:pPr>
+      <w:r>
+        <w:drawing>
+          <wp:inline distT="0" distB="0" distL="0" distR="0">
+            <wp:extent cx="5943600" cy="9264131"/>
+            <wp:docPr id="4" name="Imagem 4" descr="Figura 4 — Camada de domínio: entidades e serviços"/>
+            <a:graphic>
+              <a:graphicData uri="http://schemas.openxmlformats.org/drawingml/2006/picture">
+                <pic:pic>
+                  <pic:nvPicPr>
+                    <pic:cNvPr id="4" name="imagem4.png"/>
+                    <pic:cNvPicPr/>
+                  </pic:nvPicPr>
+                  <pic:blipFill>
+                    <a:blip r:embed="rIdImg4"/>
+                    <a:stretch>
+                      <a:fillRect/>
+                    </a:stretch>
+                  </pic:blipFill>
+                  <pic:spPr>
+                    <a:xfrm>
+                      <a:off x="0" y="0"/>
+                      <a:ext cx="5943600" cy="9264131"/>
+                    </a:xfrm>
+                    <a:prstGeom prst="rect">
+                      <a:avLst/>
+                    </a:prstGeom>
+                  </pic:spPr>
+                </pic:pic>
+              </a:graphicData>
+            </a:graphic>
+          </wp:inline>
+        </w:drawing>
+      </w:r>
+    </w:p>
+    <w:p>
+      <w:pPr>
+        <w:jc w:val="center"/>
+        <w:spacing w:before="0" w:after="240" w:line="264" w:lineRule="auto"/>
+      </w:pPr>
+      <w:r>
+        <w:rPr>
+          <w:rFonts w:ascii="SF Pro Display" w:hAnsi="SF Pro Display" w:cs="SF Pro Display"/>
+          <w:i/>
+          <w:color w:val="8C8C8C"/>
+          <w:sz w:val="18"/>
+          <w:szCs w:val="18"/>
+        </w:rPr>
+        <w:t xml:space="preserve">Figura 4 — Camada de domínio: entidades e serviços</w:t>
+      </w:r>
+    </w:p>
+    <w:p>
+      <w:pPr>
+        <w:jc w:val="center"/>
+        <w:spacing w:before="0" w:after="40" w:line="264" w:lineRule="auto"/>
+      </w:pPr>
+      <w:r>
+        <w:drawing>
+          <wp:inline distT="0" distB="0" distL="0" distR="0">
+            <wp:extent cx="5943600" cy="1955929"/>
+            <wp:docPr id="5" name="Imagem 5" descr="Figura 5 — Camada de dados: portas e implementações"/>
+            <a:graphic>
+              <a:graphicData uri="http://schemas.openxmlformats.org/drawingml/2006/picture">
+                <pic:pic>
+                  <pic:nvPicPr>
+                    <pic:cNvPr id="5" name="imagem5.png"/>
+                    <pic:cNvPicPr/>
+                  </pic:nvPicPr>
+                  <pic:blipFill>
+                    <a:blip r:embed="rIdImg5"/>
+                    <a:stretch>
+                      <a:fillRect/>
+                    </a:stretch>
+                  </pic:blipFill>
+                  <pic:spPr>
+                    <a:xfrm>
+                      <a:off x="0" y="0"/>
+                      <a:ext cx="5943600" cy="1955929"/>
+                    </a:xfrm>
+                    <a:prstGeom prst="rect">
+                      <a:avLst/>
+                    </a:prstGeom>
+                  </pic:spPr>
+                </pic:pic>
+              </a:graphicData>
+            </a:graphic>
+          </wp:inline>
+        </w:drawing>
+      </w:r>
+    </w:p>
+    <w:p>
+      <w:pPr>
+        <w:jc w:val="center"/>
+        <w:spacing w:before="0" w:after="240" w:line="264" w:lineRule="auto"/>
+      </w:pPr>
+      <w:r>
+        <w:rPr>
+          <w:rFonts w:ascii="SF Pro Display" w:hAnsi="SF Pro Display" w:cs="SF Pro Display"/>
+          <w:i/>
+          <w:color w:val="8C8C8C"/>
+          <w:sz w:val="18"/>
+          <w:szCs w:val="18"/>
+        </w:rPr>
+        <w:t xml:space="preserve">Figura 5 — Camada de dados: portas e implementações</w:t>
+      </w:r>
+    </w:p>
+    <w:p>
+      <w:pPr>
+        <w:jc w:val="center"/>
+        <w:spacing w:before="0" w:after="40" w:line="264" w:lineRule="auto"/>
+      </w:pPr>
+      <w:r>
+        <w:drawing>
+          <wp:inline distT="0" distB="0" distL="0" distR="0">
+            <wp:extent cx="5943600" cy="1008289"/>
+            <wp:docPr id="6" name="Imagem 6" descr="Figura 6 — Camada de apresentação"/>
+            <a:graphic>
+              <a:graphicData uri="http://schemas.openxmlformats.org/drawingml/2006/picture">
+                <pic:pic>
+                  <pic:nvPicPr>
+                    <pic:cNvPr id="6" name="imagem6.png"/>
+                    <pic:cNvPicPr/>
+                  </pic:nvPicPr>
+                  <pic:blipFill>
+                    <a:blip r:embed="rIdImg6"/>
+                    <a:stretch>
+                      <a:fillRect/>
+                    </a:stretch>
+                  </pic:blipFill>
+                  <pic:spPr>
+                    <a:xfrm>
+                      <a:off x="0" y="0"/>
+                      <a:ext cx="5943600" cy="1008289"/>
+                    </a:xfrm>
+                    <a:prstGeom prst="rect">
+                      <a:avLst/>
+                    </a:prstGeom>
+                  </pic:spPr>
+                </pic:pic>
+              </a:graphicData>
+            </a:graphic>
+          </wp:inline>
+        </w:drawing>
+      </w:r>
+    </w:p>
+    <w:p>
+      <w:pPr>
+        <w:jc w:val="center"/>
+        <w:spacing w:before="0" w:after="240" w:line="264" w:lineRule="auto"/>
+      </w:pPr>
+      <w:r>
+        <w:rPr>
+          <w:rFonts w:ascii="SF Pro Display" w:hAnsi="SF Pro Display" w:cs="SF Pro Display"/>
+          <w:i/>
+          <w:color w:val="8C8C8C"/>
+          <w:sz w:val="18"/>
+          <w:szCs w:val="18"/>
+        </w:rPr>
+        <w:t xml:space="preserve">Figura 6 — Camada de apresentação</w:t>
+      </w:r>
     </w:p>
     <w:p>
       <w:pPr>
@@ -23984,73 +24206,225 @@
         <w:t xml:space="preserve">Diagrama de arquitetura</w:t>
       </w:r>
     </w:p>
-    <w:tbl>
-      <w:tblPr>
-        <w:tblW w:w="9360" w:type="dxa"/>
-        <w:tblLayout w:type="fixed"/>
-        <w:tblBorders>
-          <w:top w:val="single" w:sz="4" w:space="0" w:color="D9D9D9"/>
-          <w:left w:val="single" w:sz="4" w:space="0" w:color="D9D9D9"/>
-          <w:bottom w:val="single" w:sz="4" w:space="0" w:color="D9D9D9"/>
-          <w:right w:val="single" w:sz="4" w:space="0" w:color="D9D9D9"/>
-          <w:insideH w:val="single" w:sz="4" w:space="0" w:color="D9D9D9"/>
-          <w:insideV w:val="single" w:sz="4" w:space="0" w:color="D9D9D9"/>
-        </w:tblBorders>
-      </w:tblPr>
-      <w:tblGrid>
-        <w:gridCol w:w="9360"/>
-      </w:tblGrid>
-      <w:tr>
-        <w:tc>
-          <w:tcPr>
-            <w:tcW w:w="9360" w:type="dxa"/>
-            <w:vAlign w:val="top"/>
-            <w:tcMar>
-              <w:top w:w="90" w:type="dxa"/>
-              <w:left w:w="120" w:type="dxa"/>
-              <w:bottom w:w="90" w:type="dxa"/>
-              <w:right w:w="120" w:type="dxa"/>
-            </w:tcMar>
-          </w:tcPr>
-          <w:p>
-            <w:pPr>
-              <w:jc w:val="center"/>
-              <w:spacing w:before="0" w:after="40" w:line="264" w:lineRule="auto"/>
-            </w:pPr>
-            <w:r>
-              <w:rPr>
-                <w:rFonts w:ascii="SF Pro Display" w:hAnsi="SF Pro Display" w:cs="SF Pro Display"/>
-                <w:b/>
-                <w:color w:val="8C8C8C"/>
-                <w:sz w:val="22"/>
-                <w:szCs w:val="22"/>
-              </w:rPr>
-              <w:t xml:space="preserve">Diagrama de Arquitetura</w:t>
-            </w:r>
-          </w:p>
-          <w:p>
-            <w:pPr>
-              <w:jc w:val="center"/>
-              <w:spacing w:before="0" w:after="0" w:line="264" w:lineRule="auto"/>
-            </w:pPr>
-            <w:r>
-              <w:rPr>
-                <w:rFonts w:ascii="SF Pro Display" w:hAnsi="SF Pro Display" w:cs="SF Pro Display"/>
-                <w:i/>
-                <w:color w:val="8C8C8C"/>
-                <w:sz w:val="18"/>
-                <w:szCs w:val="18"/>
-              </w:rPr>
-              <w:t xml:space="preserve">Inserir o diagrama aqui, com as quatro camadas, os três clientes (profissional, estabelecimento e painel) e as dependências externas de push, geolocalização e backend.</w:t>
-            </w:r>
-          </w:p>
-        </w:tc>
-      </w:tr>
-    </w:tbl>
     <w:p>
       <w:pPr>
-        <w:spacing w:before="0" w:after="0" w:line="264" w:lineRule="auto"/>
+        <w:jc w:val="center"/>
+        <w:spacing w:before="0" w:after="40" w:line="264" w:lineRule="auto"/>
       </w:pPr>
+      <w:r>
+        <w:drawing>
+          <wp:inline distT="0" distB="0" distL="0" distR="0">
+            <wp:extent cx="5943600" cy="3832860"/>
+            <wp:docPr id="7" name="Imagem 7" descr="Figura 7 — Contexto: atores e dependências externas"/>
+            <a:graphic>
+              <a:graphicData uri="http://schemas.openxmlformats.org/drawingml/2006/picture">
+                <pic:pic>
+                  <pic:nvPicPr>
+                    <pic:cNvPr id="7" name="imagem7.png"/>
+                    <pic:cNvPicPr/>
+                  </pic:nvPicPr>
+                  <pic:blipFill>
+                    <a:blip r:embed="rIdImg7"/>
+                    <a:stretch>
+                      <a:fillRect/>
+                    </a:stretch>
+                  </pic:blipFill>
+                  <pic:spPr>
+                    <a:xfrm>
+                      <a:off x="0" y="0"/>
+                      <a:ext cx="5943600" cy="3832860"/>
+                    </a:xfrm>
+                    <a:prstGeom prst="rect">
+                      <a:avLst/>
+                    </a:prstGeom>
+                  </pic:spPr>
+                </pic:pic>
+              </a:graphicData>
+            </a:graphic>
+          </wp:inline>
+        </w:drawing>
+      </w:r>
+    </w:p>
+    <w:p>
+      <w:pPr>
+        <w:jc w:val="center"/>
+        <w:spacing w:before="0" w:after="240" w:line="264" w:lineRule="auto"/>
+      </w:pPr>
+      <w:r>
+        <w:rPr>
+          <w:rFonts w:ascii="SF Pro Display" w:hAnsi="SF Pro Display" w:cs="SF Pro Display"/>
+          <w:i/>
+          <w:color w:val="8C8C8C"/>
+          <w:sz w:val="18"/>
+          <w:szCs w:val="18"/>
+        </w:rPr>
+        <w:t xml:space="preserve">Figura 7 — Contexto: atores e dependências externas</w:t>
+      </w:r>
+    </w:p>
+    <w:p>
+      <w:pPr>
+        <w:jc w:val="center"/>
+        <w:spacing w:before="0" w:after="40" w:line="264" w:lineRule="auto"/>
+      </w:pPr>
+      <w:r>
+        <w:drawing>
+          <wp:inline distT="0" distB="0" distL="0" distR="0">
+            <wp:extent cx="5943600" cy="3782980"/>
+            <wp:docPr id="8" name="Imagem 8" descr="Figura 8 — Contêineres: os três clientes, o backend e o push"/>
+            <a:graphic>
+              <a:graphicData uri="http://schemas.openxmlformats.org/drawingml/2006/picture">
+                <pic:pic>
+                  <pic:nvPicPr>
+                    <pic:cNvPr id="8" name="imagem8.png"/>
+                    <pic:cNvPicPr/>
+                  </pic:nvPicPr>
+                  <pic:blipFill>
+                    <a:blip r:embed="rIdImg8"/>
+                    <a:stretch>
+                      <a:fillRect/>
+                    </a:stretch>
+                  </pic:blipFill>
+                  <pic:spPr>
+                    <a:xfrm>
+                      <a:off x="0" y="0"/>
+                      <a:ext cx="5943600" cy="3782980"/>
+                    </a:xfrm>
+                    <a:prstGeom prst="rect">
+                      <a:avLst/>
+                    </a:prstGeom>
+                  </pic:spPr>
+                </pic:pic>
+              </a:graphicData>
+            </a:graphic>
+          </wp:inline>
+        </w:drawing>
+      </w:r>
+    </w:p>
+    <w:p>
+      <w:pPr>
+        <w:jc w:val="center"/>
+        <w:spacing w:before="0" w:after="240" w:line="264" w:lineRule="auto"/>
+      </w:pPr>
+      <w:r>
+        <w:rPr>
+          <w:rFonts w:ascii="SF Pro Display" w:hAnsi="SF Pro Display" w:cs="SF Pro Display"/>
+          <w:i/>
+          <w:color w:val="8C8C8C"/>
+          <w:sz w:val="18"/>
+          <w:szCs w:val="18"/>
+        </w:rPr>
+        <w:t xml:space="preserve">Figura 8 — Contêineres: os três clientes, o backend e o push</w:t>
+      </w:r>
+    </w:p>
+    <w:p>
+      <w:pPr>
+        <w:jc w:val="center"/>
+        <w:spacing w:before="0" w:after="40" w:line="264" w:lineRule="auto"/>
+      </w:pPr>
+      <w:r>
+        <w:drawing>
+          <wp:inline distT="0" distB="0" distL="0" distR="0">
+            <wp:extent cx="5943600" cy="1645103"/>
+            <wp:docPr id="9" name="Imagem 9" descr="Figura 9 — As quatro camadas dentro do app iOS"/>
+            <a:graphic>
+              <a:graphicData uri="http://schemas.openxmlformats.org/drawingml/2006/picture">
+                <pic:pic>
+                  <pic:nvPicPr>
+                    <pic:cNvPr id="9" name="imagem9.png"/>
+                    <pic:cNvPicPr/>
+                  </pic:nvPicPr>
+                  <pic:blipFill>
+                    <a:blip r:embed="rIdImg9"/>
+                    <a:stretch>
+                      <a:fillRect/>
+                    </a:stretch>
+                  </pic:blipFill>
+                  <pic:spPr>
+                    <a:xfrm>
+                      <a:off x="0" y="0"/>
+                      <a:ext cx="5943600" cy="1645103"/>
+                    </a:xfrm>
+                    <a:prstGeom prst="rect">
+                      <a:avLst/>
+                    </a:prstGeom>
+                  </pic:spPr>
+                </pic:pic>
+              </a:graphicData>
+            </a:graphic>
+          </wp:inline>
+        </w:drawing>
+      </w:r>
+    </w:p>
+    <w:p>
+      <w:pPr>
+        <w:jc w:val="center"/>
+        <w:spacing w:before="0" w:after="240" w:line="264" w:lineRule="auto"/>
+      </w:pPr>
+      <w:r>
+        <w:rPr>
+          <w:rFonts w:ascii="SF Pro Display" w:hAnsi="SF Pro Display" w:cs="SF Pro Display"/>
+          <w:i/>
+          <w:color w:val="8C8C8C"/>
+          <w:sz w:val="18"/>
+          <w:szCs w:val="18"/>
+        </w:rPr>
+        <w:t xml:space="preserve">Figura 9 — As quatro camadas dentro do app iOS</w:t>
+      </w:r>
+    </w:p>
+    <w:p>
+      <w:pPr>
+        <w:jc w:val="center"/>
+        <w:spacing w:before="0" w:after="40" w:line="264" w:lineRule="auto"/>
+      </w:pPr>
+      <w:r>
+        <w:drawing>
+          <wp:inline distT="0" distB="0" distL="0" distR="0">
+            <wp:extent cx="5943600" cy="4078643"/>
+            <wp:docPr id="10" name="Imagem 10" descr="Figura 10 — O caminho crítico: da publicação à confirmação"/>
+            <a:graphic>
+              <a:graphicData uri="http://schemas.openxmlformats.org/drawingml/2006/picture">
+                <pic:pic>
+                  <pic:nvPicPr>
+                    <pic:cNvPr id="10" name="imagem10.png"/>
+                    <pic:cNvPicPr/>
+                  </pic:nvPicPr>
+                  <pic:blipFill>
+                    <a:blip r:embed="rIdImg10"/>
+                    <a:stretch>
+                      <a:fillRect/>
+                    </a:stretch>
+                  </pic:blipFill>
+                  <pic:spPr>
+                    <a:xfrm>
+                      <a:off x="0" y="0"/>
+                      <a:ext cx="5943600" cy="4078643"/>
+                    </a:xfrm>
+                    <a:prstGeom prst="rect">
+                      <a:avLst/>
+                    </a:prstGeom>
+                  </pic:spPr>
+                </pic:pic>
+              </a:graphicData>
+            </a:graphic>
+          </wp:inline>
+        </w:drawing>
+      </w:r>
+    </w:p>
+    <w:p>
+      <w:pPr>
+        <w:jc w:val="center"/>
+        <w:spacing w:before="0" w:after="240" w:line="264" w:lineRule="auto"/>
+      </w:pPr>
+      <w:r>
+        <w:rPr>
+          <w:rFonts w:ascii="SF Pro Display" w:hAnsi="SF Pro Display" w:cs="SF Pro Display"/>
+          <w:i/>
+          <w:color w:val="8C8C8C"/>
+          <w:sz w:val="18"/>
+          <w:szCs w:val="18"/>
+        </w:rPr>
+        <w:t xml:space="preserve">Figura 10 — O caminho crítico: da publicação à confirmação</w:t>
+      </w:r>
     </w:p>
     <w:p>
       <w:pPr>
@@ -28167,7 +28541,7 @@
 </file>
 
 <file path=word/footer1.xml><?xml version="1.0" encoding="utf-8"?>
-<w:ftr xmlns:w="http://schemas.openxmlformats.org/wordprocessingml/2006/main" xmlns:r="http://schemas.openxmlformats.org/officeDocument/2006/relationships">
+<w:ftr xmlns:w="http://schemas.openxmlformats.org/wordprocessingml/2006/main" xmlns:r="http://schemas.openxmlformats.org/officeDocument/2006/relationships" xmlns:wp="http://schemas.openxmlformats.org/drawingml/2006/wordprocessingDrawing" xmlns:a="http://schemas.openxmlformats.org/drawingml/2006/main" xmlns:pic="http://schemas.openxmlformats.org/drawingml/2006/picture">
   <w:p>
     <w:pPr>
       <w:jc w:val="right"/>

</xml_diff>

<commit_message>
Sincroniza Frila_Documento_de_Requisitos.docx e atualiza export do CBL_C18.pages
</commit_message>
<xml_diff>
--- a/doc-harness/01 - CBL/Desafios/C18/Documentos de Produto/Frila_Documento_de_Requisitos.docx
+++ b/doc-harness/01 - CBL/Desafios/C18/Documentos de Produto/Frila_Documento_de_Requisitos.docx
@@ -2271,7 +2271,7 @@
                 <w:sz w:val="20"/>
                 <w:szCs w:val="20"/>
               </w:rPr>
-              <w:t xml:space="preserve">Contratantes de food service (bares, restaurantes, cafeterias e similares), contratantes de evento (buffets, produtoras e empresas de staff), coordenações de campanha política, e profissionais operacionais que trabalham por turno avulso. Praça inicial: Distrito Federal.</w:t>
+              <w:t xml:space="preserve">Contratantes de food service (bares, restaurantes, cafeterias e similares), contratantes de evento (buffets, produtoras e empresas de staff), coordenações de campanha, e profissionais operacionais que trabalham por turno avulso. Praça inicial: Distrito Federal.</w:t>
             </w:r>
           </w:p>
         </w:tc>
@@ -3947,7 +3947,7 @@
                 <w:sz w:val="20"/>
                 <w:szCs w:val="20"/>
               </w:rPr>
-              <w:t xml:space="preserve">Para vaga de campanha política, o sistema DEVE permitir exportar o registro de quem trabalhou, quando e por qual valor.</w:t>
+              <w:t xml:space="preserve">O sistema DEVE permitir ao contratante exportar o relatório consolidado de turnos realizados com data, horários auditados, valor acordado e profissional alocado.</w:t>
             </w:r>
           </w:p>
         </w:tc>
@@ -3974,7 +3974,7 @@
                 <w:sz w:val="20"/>
                 <w:szCs w:val="20"/>
               </w:rPr>
-              <w:t xml:space="preserve">Campanha presta contas, e despesa de pessoal é declarável. A Portaria TSE nº 444/2026 fixa teto de contratação, no DF a partir de 300 pessoas por chapa, e estourá-lo pode configurar corrupção eleitoral.</w:t>
+              <w:t xml:space="preserve">Garante suporte ao fechamento contábil e conciliação financeira de restaurantes, bares e buffets, bem como à prestação de contas exigida em campanhas e produções de grande porte.</w:t>
             </w:r>
           </w:p>
         </w:tc>
@@ -19983,7 +19983,7 @@
                 <w:sz w:val="20"/>
                 <w:szCs w:val="20"/>
               </w:rPr>
-              <w:t xml:space="preserve">Contratante: bar, restaurante, buffet, produtora ou campanha.</w:t>
+              <w:t xml:space="preserve">Contratante: bar, restaurante, buffet, produtora ou coordenação de campanha.</w:t>
             </w:r>
           </w:p>
         </w:tc>

</xml_diff>

<commit_message>
Tira as metas de tempo e de toques dos documentos do Frila e da T-0011
A vaga publicada em 60 segundos, o aceite com um toque, a republicação em
20 segundos, o cadastro em 3 minutos e os 3 toques saem dos espelhos, dos
documentos derivados, do Backlog (.pages, PDF e Markdown), das notas de
arquitetura e do escopo do protótipo na T-0011. As metas passam a ser
definidas depois de medidas no piloto.

Co-Authored-By: Claude Opus 5 (1M context) <noreply@anthropic.com>
</commit_message>
<xml_diff>
--- a/doc-harness/01 - CBL/Desafios/C18/Documentos de Produto/Frila_Documento_de_Requisitos.docx
+++ b/doc-harness/01 - CBL/Desafios/C18/Documentos de Produto/Frila_Documento_de_Requisitos.docx
@@ -818,7 +818,7 @@
                 <w:sz w:val="20"/>
                 <w:szCs w:val="20"/>
               </w:rPr>
-              <w:t xml:space="preserve">Aplica as respostas do quadro 03 de pendências (21 e 22/09): plataforma horizontal e sem campanha política; despacho por proximidade (até 15 km), sem raio configurável e sem levas, com teto de notificações (RN23); check-in geolocalizado a 200 m com confirmação manual (RN22); avaliação só com presença verificada e nova definição de taxa de comparecimento; aval herdado retirado (RF17 e UC12); Painel como feature web do gestor e Equipe Frila só por e-mail; denúncia e bloqueio (RF26 e UC17); explicação do despacho (RF27); turnos sobrepostos (RN21) e modo seleção (RN24) viram regra; stack decidida (Swift/SwiftUI, Kotlin, Supabase, FCM, SwiftData); entidade Dispositivo e contrato da API em Documentos/API/openapi.yaml.</w:t>
+              <w:t xml:space="preserve">Aplica as respostas do quadro 03 de pendências (21 e 22/09): plataforma horizontal e sem campanha política; despacho por proximidade (até 15 km), sem raio configurável e sem levas, com teto de notificações (RN23); check-in geolocalizado a 200 m com confirmação manual (RN22); avaliação só com presença verificada e nova definição de taxa de comparecimento; aval herdado retirado (RF17 e UC12); Painel como feature web do gestor e Equipe Frila só por e-mail; denúncia e bloqueio (RF26 e UC17); explicação do despacho (RF27); turnos sobrepostos (RN21) e modo seleção (RN24) viram regra; stack decidida (Swift/SwiftUI, Kotlin, Supabase, FCM, SwiftData); entidade Dispositivo e contrato da API em Documentos/API/openapi.yaml; metas de tempo de publicação e de número de toques retiradas até haver medição no piloto.</w:t>
             </w:r>
           </w:p>
         </w:tc>
@@ -3447,7 +3447,7 @@
                 <w:sz w:val="20"/>
                 <w:szCs w:val="20"/>
               </w:rPr>
-              <w:t xml:space="preserve">Candidatura em um toque é o que torna possível preencher um turno em minutos. Negociação reintroduz o funil que o produto existe para eliminar.</w:t>
+              <w:t xml:space="preserve">Candidatura sem formulário e sem negociação é o que torna possível preencher um turno a tempo. Negociação reintroduz o funil que o produto existe para eliminar.</w:t>
             </w:r>
           </w:p>
         </w:tc>
@@ -5479,7 +5479,7 @@
                 <w:sz w:val="20"/>
                 <w:szCs w:val="20"/>
               </w:rPr>
-              <w:t xml:space="preserve">Um profissional conclui o cadastro e fica apto a receber despacho em menos de 3 minutos, sem envio de documento.</w:t>
+              <w:t xml:space="preserve">Um profissional conclui o cadastro e fica apto a receber notificações de vaga sem enviar documento.</w:t>
             </w:r>
           </w:p>
         </w:tc>
@@ -5809,7 +5809,7 @@
                 <w:sz w:val="20"/>
                 <w:szCs w:val="20"/>
               </w:rPr>
-              <w:t xml:space="preserve">O fluxo completo de publicação é concluído em menos de 60 segundos no celular; o modo de preenchimento e a antecedência do alerta de vaga vazia (padrão de 3 horas) são escolhidos na publicação; a vaga é rejeitada com mensagem clara se algum campo obrigatório de RN02 faltar.</w:t>
+              <w:t xml:space="preserve">A publicação pede só os campos de RN02, com o local pré-preenchido pelo endereço do estabelecimento; o modo de preenchimento e a antecedência do alerta de vaga vazia (padrão de 3 horas) são escolhidos na publicação; a vaga é rejeitada com mensagem clara se algum campo obrigatório de RN02 faltar.</w:t>
             </w:r>
           </w:p>
         </w:tc>
@@ -5919,7 +5919,7 @@
                 <w:sz w:val="20"/>
                 <w:szCs w:val="20"/>
               </w:rPr>
-              <w:t xml:space="preserve">A republicação de uma vaga recorrente é concluída em menos de 20 segundos.</w:t>
+              <w:t xml:space="preserve">A republicação copia todos os campos da vaga de origem e pede só a nova data e o novo horário.</w:t>
             </w:r>
           </w:p>
         </w:tc>
@@ -6195,7 +6195,7 @@
                 <w:sz w:val="20"/>
                 <w:szCs w:val="20"/>
               </w:rPr>
-              <w:t xml:space="preserve">O sistema deve permitir que o profissional se candidate a uma posição em um único toque a partir da notificação ou da lista.</w:t>
+              <w:t xml:space="preserve">O sistema deve permitir que o profissional se candidate a uma vaga direto da notificação ou da lista, sem formulário.</w:t>
             </w:r>
           </w:p>
         </w:tc>
@@ -6249,7 +6249,7 @@
                 <w:sz w:val="20"/>
                 <w:szCs w:val="20"/>
               </w:rPr>
-              <w:t xml:space="preserve">A candidatura é concluída em no máximo 3 toques contados desde a notificação, sem formulário e sem negociação de valor.</w:t>
+              <w:t xml:space="preserve">A candidatura sai da notificação ou da lista sem formulário, sem carta de apresentação e sem negociação de valor.</w:t>
             </w:r>
           </w:p>
         </w:tc>
@@ -6469,7 +6469,7 @@
                 <w:sz w:val="20"/>
                 <w:szCs w:val="20"/>
               </w:rPr>
-              <w:t xml:space="preserve">Ambos recebem a confirmação em até 60 segundos; a posição some das vagas abertas; nenhuma posição é confirmada para dois profissionais (RN19).</w:t>
+              <w:t xml:space="preserve">A confirmação é enviada aos dois lados pelo provedor de push, na meta de RNF02; a posição some das vagas abertas; nenhuma posição é confirmada para dois profissionais (RN19).</w:t>
             </w:r>
           </w:p>
         </w:tc>
@@ -11614,7 +11614,7 @@
                 <w:sz w:val="20"/>
                 <w:szCs w:val="20"/>
               </w:rPr>
-              <w:t xml:space="preserve">As telas principais devem carregar em menos de 2 segundos em conexão 4G, e o fluxo completo de publicação de vaga deve ser concluído em menos de 60 segundos.</w:t>
+              <w:t xml:space="preserve">As telas principais devem carregar em menos de 2 segundos em conexão 4G.</w:t>
             </w:r>
           </w:p>
         </w:tc>
@@ -12548,7 +12548,7 @@
                 <w:sz w:val="20"/>
                 <w:szCs w:val="20"/>
               </w:rPr>
-              <w:t xml:space="preserve">Em teste com usuários reais, um profissional de primeira viagem conclui uma candidatura em até 3 toques a partir da notificação, sem ajuda, em pelo menos 8 de 10 tentativas.</w:t>
+              <w:t xml:space="preserve">Em teste com usuários reais, um profissional de primeira viagem conclui uma candidatura e um contratante publica uma vaga, os dois sem ajuda. Metas de tempo e de número de toques só serão definidas depois de medidas no piloto.</w:t>
             </w:r>
           </w:p>
         </w:tc>
@@ -17551,7 +17551,7 @@
                 <w:sz w:val="20"/>
                 <w:szCs w:val="20"/>
               </w:rPr>
-              <w:t xml:space="preserve">Dado que sou um contratante autenticado com estabelecimento cadastrado, quando preencho os campos obrigatórios e confirmo, então a vaga é publicada em menos de 60 segundos e a notificação aos profissionais elegíveis é disparada.</w:t>
+              <w:t xml:space="preserve">Dado que sou um contratante autenticado com estabelecimento cadastrado, quando preencho os campos obrigatórios e confirmo, então a vaga é publicada e a notificação aos profissionais elegíveis é disparada.</w:t>
             </w:r>
           </w:p>
         </w:tc>
@@ -18433,7 +18433,7 @@
                 <w:sz w:val="20"/>
                 <w:szCs w:val="20"/>
               </w:rPr>
-              <w:t xml:space="preserve">3. O profissional se candidata com um toque. A tela avisa que, se ele for confirmado, telefone e WhatsApp serão mostrados ao estabelecimento (RN10).</w:t>
+              <w:t xml:space="preserve">3. O profissional se candidata, sem formulário. A tela avisa que, se ele for confirmado, telefone e WhatsApp serão mostrados ao estabelecimento (RN10).</w:t>
             </w:r>
             <w:r>
               <w:rPr>
@@ -18729,7 +18729,7 @@
                 <w:sz w:val="20"/>
                 <w:szCs w:val="20"/>
               </w:rPr>
-              <w:t xml:space="preserve">Dado que recebi a notificação de uma vaga elegível, quando toco em candidatar-me, então a candidatura é registrada em no máximo 3 toques contados desde a notificação, sem formulário e sem negociação de valor.</w:t>
+              <w:t xml:space="preserve">Dado que recebi a notificação de uma vaga elegível, quando toco em candidatar-me, então a candidatura é registrada sem formulário e sem negociação de valor.</w:t>
             </w:r>
           </w:p>
         </w:tc>
@@ -19300,7 +19300,7 @@
                 <w:sz w:val="20"/>
                 <w:szCs w:val="20"/>
               </w:rPr>
-              <w:t xml:space="preserve">Dado que há candidaturas para uma posição, quando a confirmação ocorre, então os dois lados recebem a notificação com os dados completos do turno em até 60 segundos, o contato é liberado e a posição deixa de aparecer entre as vagas abertas.</w:t>
+              <w:t xml:space="preserve">Dado que há candidaturas para uma posição, quando a confirmação ocorre, então os dois lados recebem a notificação com os dados completos do turno, o contato é liberado e a posição deixa de aparecer entre as vagas abertas.</w:t>
             </w:r>
           </w:p>
         </w:tc>
@@ -22155,7 +22155,7 @@
                 <w:sz w:val="20"/>
                 <w:szCs w:val="20"/>
               </w:rPr>
-              <w:t xml:space="preserve">Dado que tenho 18 anos ou mais, quando informo nome, telefone, e-mail, funções, ponto base e disponibilidade, então fico apto a receber notificações de vaga em menos de 3 minutos, sem enviar documento e sem pagar nada.</w:t>
+              <w:t xml:space="preserve">Dado que tenho 18 anos ou mais, quando informo nome, telefone, e-mail, funções, ponto base e disponibilidade, então fico apto a receber notificações de vaga sem enviar documento e sem pagar nada.</w:t>
             </w:r>
           </w:p>
         </w:tc>
@@ -33510,7 +33510,7 @@
                 <w:sz w:val="20"/>
                 <w:szCs w:val="20"/>
               </w:rPr>
-              <w:t xml:space="preserve">Candidatura em um toque</w:t>
+              <w:t xml:space="preserve">Candidatura sem formulário</w:t>
             </w:r>
           </w:p>
         </w:tc>

</xml_diff>

<commit_message>
Aplica as pendências para codar às notas de arquitetura e aos documentos do Frila
- Modelagem de Banco: usuario.perfil fixo (RN25), telefone sem unicidade,
  fim do disponivel_agora_ate e a seção de políticas de acesso (RLS) para
  as 19 tabelas, com o SQL testado num Postgres local.
- Arquitetura, Classe e Casos de Uso: um app com dois perfis, entrada por
  código no e-mail, onde fica o código e web depois do iOS.
- Pendências Técnicas: respostas de 22/09 e a revisão do time (B05) feita.
- Espelhos, documentos derivados e Backlog (.pages, PDF e Markdown)
  regenerados.

Co-Authored-By: Claude Opus 5 (1M context) <noreply@anthropic.com>
</commit_message>
<xml_diff>
--- a/doc-harness/01 - CBL/Desafios/C18/Documentos de Produto/Frila_Documento_de_Requisitos.docx
+++ b/doc-harness/01 - CBL/Desafios/C18/Documentos de Produto/Frila_Documento_de_Requisitos.docx
@@ -269,7 +269,7 @@
                 <w:sz w:val="20"/>
                 <w:szCs w:val="20"/>
               </w:rPr>
-              <w:t xml:space="preserve">v1.2.0</w:t>
+              <w:t xml:space="preserve">v1.3.0</w:t>
             </w:r>
           </w:p>
         </w:tc>
@@ -823,6 +823,116 @@
           </w:p>
         </w:tc>
       </w:tr>
+      <w:tr>
+        <w:tc>
+          <w:tcPr>
+            <w:tcW w:w="1100" w:type="dxa"/>
+            <w:shd w:val="clear" w:color="auto" w:fill="FFFFFF"/>
+            <w:vAlign w:val="top"/>
+            <w:tcMar>
+              <w:top w:w="90" w:type="dxa"/>
+              <w:left w:w="120" w:type="dxa"/>
+              <w:bottom w:w="90" w:type="dxa"/>
+              <w:right w:w="120" w:type="dxa"/>
+            </w:tcMar>
+          </w:tcPr>
+          <w:p>
+            <w:pPr>
+              <w:spacing w:before="0" w:after="0" w:line="264" w:lineRule="auto"/>
+            </w:pPr>
+            <w:r>
+              <w:rPr>
+                <w:rFonts w:ascii="SF Pro Display" w:hAnsi="SF Pro Display" w:cs="SF Pro Display"/>
+                <w:color w:val="1A1A1A"/>
+                <w:sz w:val="20"/>
+                <w:szCs w:val="20"/>
+              </w:rPr>
+              <w:t xml:space="preserve">v1.3.0</w:t>
+            </w:r>
+          </w:p>
+        </w:tc>
+        <w:tc>
+          <w:tcPr>
+            <w:tcW w:w="1200" w:type="dxa"/>
+            <w:shd w:val="clear" w:color="auto" w:fill="FFFFFF"/>
+            <w:vAlign w:val="top"/>
+            <w:tcMar>
+              <w:top w:w="90" w:type="dxa"/>
+              <w:left w:w="120" w:type="dxa"/>
+              <w:bottom w:w="90" w:type="dxa"/>
+              <w:right w:w="120" w:type="dxa"/>
+            </w:tcMar>
+          </w:tcPr>
+          <w:p>
+            <w:pPr>
+              <w:spacing w:before="0" w:after="0" w:line="264" w:lineRule="auto"/>
+            </w:pPr>
+            <w:r>
+              <w:rPr>
+                <w:rFonts w:ascii="SF Pro Display" w:hAnsi="SF Pro Display" w:cs="SF Pro Display"/>
+                <w:color w:val="1A1A1A"/>
+                <w:sz w:val="20"/>
+                <w:szCs w:val="20"/>
+              </w:rPr>
+              <w:t xml:space="preserve">22/09/2026</w:t>
+            </w:r>
+          </w:p>
+        </w:tc>
+        <w:tc>
+          <w:tcPr>
+            <w:tcW w:w="2760" w:type="dxa"/>
+            <w:shd w:val="clear" w:color="auto" w:fill="FFFFFF"/>
+            <w:vAlign w:val="top"/>
+            <w:tcMar>
+              <w:top w:w="90" w:type="dxa"/>
+              <w:left w:w="120" w:type="dxa"/>
+              <w:bottom w:w="90" w:type="dxa"/>
+              <w:right w:w="120" w:type="dxa"/>
+            </w:tcMar>
+          </w:tcPr>
+          <w:p>
+            <w:pPr>
+              <w:spacing w:before="0" w:after="0" w:line="264" w:lineRule="auto"/>
+            </w:pPr>
+            <w:r>
+              <w:rPr>
+                <w:rFonts w:ascii="SF Pro Display" w:hAnsi="SF Pro Display" w:cs="SF Pro Display"/>
+                <w:color w:val="1A1A1A"/>
+                <w:sz w:val="20"/>
+                <w:szCs w:val="20"/>
+              </w:rPr>
+              <w:t xml:space="preserve">Cauê Carneiro, Fabrício Tosta, João Paulo, Júlia Clovandi, Matheus Silva</w:t>
+            </w:r>
+          </w:p>
+        </w:tc>
+        <w:tc>
+          <w:tcPr>
+            <w:tcW w:w="4300" w:type="dxa"/>
+            <w:shd w:val="clear" w:color="auto" w:fill="FFFFFF"/>
+            <w:vAlign w:val="top"/>
+            <w:tcMar>
+              <w:top w:w="90" w:type="dxa"/>
+              <w:left w:w="120" w:type="dxa"/>
+              <w:bottom w:w="90" w:type="dxa"/>
+              <w:right w:w="120" w:type="dxa"/>
+            </w:tcMar>
+          </w:tcPr>
+          <w:p>
+            <w:pPr>
+              <w:spacing w:before="0" w:after="0" w:line="264" w:lineRule="auto"/>
+            </w:pPr>
+            <w:r>
+              <w:rPr>
+                <w:rFonts w:ascii="SF Pro Display" w:hAnsi="SF Pro Display" w:cs="SF Pro Display"/>
+                <w:color w:val="1A1A1A"/>
+                <w:sz w:val="20"/>
+                <w:szCs w:val="20"/>
+              </w:rPr>
+              <w:t xml:space="preserve">Aplica as respostas das pendências para codar (22/09): um app só, com um perfil por conta (RN25); entrada por código no e-mail, sem senha e sem SMS, com telefone obrigatório e sem verificação (RF01, UC09 e UC10); botão “disponível agora” retirado (RF03 e UC09); entidade Usuario com o perfil da conta e SessaoUsuario sem troca de perfil.</w:t>
+            </w:r>
+          </w:p>
+        </w:tc>
+      </w:tr>
     </w:tbl>
     <w:p>
       <w:pPr>
@@ -2497,7 +2607,7 @@
                 <w:sz w:val="20"/>
                 <w:szCs w:val="20"/>
               </w:rPr>
-              <w:t xml:space="preserve">Feature da versão web do app do estabelecimento: dashboard do gestor para acompanhar vagas, contratados e turnos. Não é ferramenta interna do Frila.</w:t>
+              <w:t xml:space="preserve">Feature da versão web do Frila, no perfil de contratante: dashboard do gestor para acompanhar vagas, contratados e turnos. Não é ferramenta interna do Frila.</w:t>
             </w:r>
           </w:p>
         </w:tc>
@@ -2553,6 +2663,89 @@
                 <w:sz w:val="20"/>
                 <w:szCs w:val="20"/>
               </w:rPr>
+              <w:t xml:space="preserve">Perfil</w:t>
+            </w:r>
+          </w:p>
+        </w:tc>
+        <w:tc>
+          <w:tcPr>
+            <w:tcW w:w="4900" w:type="dxa"/>
+            <w:shd w:val="clear" w:color="auto" w:fill="FFFFFF"/>
+            <w:vAlign w:val="top"/>
+            <w:tcMar>
+              <w:top w:w="90" w:type="dxa"/>
+              <w:left w:w="120" w:type="dxa"/>
+              <w:bottom w:w="90" w:type="dxa"/>
+              <w:right w:w="120" w:type="dxa"/>
+            </w:tcMar>
+          </w:tcPr>
+          <w:p>
+            <w:pPr>
+              <w:spacing w:before="0" w:after="0" w:line="264" w:lineRule="auto"/>
+            </w:pPr>
+            <w:r>
+              <w:rPr>
+                <w:rFonts w:ascii="SF Pro Display" w:hAnsi="SF Pro Display" w:cs="SF Pro Display"/>
+                <w:color w:val="1A1A1A"/>
+                <w:sz w:val="20"/>
+                <w:szCs w:val="20"/>
+              </w:rPr>
+              <w:t xml:space="preserve">Tipo da conta: profissional, para quem trabalha no turno, ou contratante, para quem publica pelo estabelecimento. É escolhido no cadastro e não muda (RN25).</w:t>
+            </w:r>
+          </w:p>
+        </w:tc>
+        <w:tc>
+          <w:tcPr>
+            <w:tcW w:w="2460" w:type="dxa"/>
+            <w:shd w:val="clear" w:color="auto" w:fill="FFFFFF"/>
+            <w:vAlign w:val="top"/>
+            <w:tcMar>
+              <w:top w:w="90" w:type="dxa"/>
+              <w:left w:w="120" w:type="dxa"/>
+              <w:bottom w:w="90" w:type="dxa"/>
+              <w:right w:w="120" w:type="dxa"/>
+            </w:tcMar>
+          </w:tcPr>
+          <w:p>
+            <w:pPr>
+              <w:spacing w:before="0" w:after="0" w:line="264" w:lineRule="auto"/>
+            </w:pPr>
+            <w:r>
+              <w:rPr>
+                <w:rFonts w:ascii="SF Pro Display" w:hAnsi="SF Pro Display" w:cs="SF Pro Display"/>
+                <w:color w:val="1A1A1A"/>
+                <w:sz w:val="20"/>
+                <w:szCs w:val="20"/>
+              </w:rPr>
+              <w:t xml:space="preserve">Seções 1, 2 e 3</w:t>
+            </w:r>
+          </w:p>
+        </w:tc>
+      </w:tr>
+      <w:tr>
+        <w:tc>
+          <w:tcPr>
+            <w:tcW w:w="2000" w:type="dxa"/>
+            <w:shd w:val="clear" w:color="auto" w:fill="F7F7F7"/>
+            <w:vAlign w:val="top"/>
+            <w:tcMar>
+              <w:top w:w="90" w:type="dxa"/>
+              <w:left w:w="120" w:type="dxa"/>
+              <w:bottom w:w="90" w:type="dxa"/>
+              <w:right w:w="120" w:type="dxa"/>
+            </w:tcMar>
+          </w:tcPr>
+          <w:p>
+            <w:pPr>
+              <w:spacing w:before="0" w:after="0" w:line="264" w:lineRule="auto"/>
+            </w:pPr>
+            <w:r>
+              <w:rPr>
+                <w:rFonts w:ascii="SF Pro Display" w:hAnsi="SF Pro Display" w:cs="SF Pro Display"/>
+                <w:color w:val="1A1A1A"/>
+                <w:sz w:val="20"/>
+                <w:szCs w:val="20"/>
+              </w:rPr>
               <w:t xml:space="preserve">Equipe Frila</w:t>
             </w:r>
           </w:p>
@@ -2560,7 +2753,7 @@
         <w:tc>
           <w:tcPr>
             <w:tcW w:w="4900" w:type="dxa"/>
-            <w:shd w:val="clear" w:color="auto" w:fill="FFFFFF"/>
+            <w:shd w:val="clear" w:color="auto" w:fill="F7F7F7"/>
             <w:vAlign w:val="top"/>
             <w:tcMar>
               <w:top w:w="90" w:type="dxa"/>
@@ -2587,7 +2780,7 @@
         <w:tc>
           <w:tcPr>
             <w:tcW w:w="2460" w:type="dxa"/>
-            <w:shd w:val="clear" w:color="auto" w:fill="FFFFFF"/>
+            <w:shd w:val="clear" w:color="auto" w:fill="F7F7F7"/>
             <w:vAlign w:val="top"/>
             <w:tcMar>
               <w:top w:w="90" w:type="dxa"/>
@@ -2616,7 +2809,7 @@
         <w:tc>
           <w:tcPr>
             <w:tcW w:w="2000" w:type="dxa"/>
-            <w:shd w:val="clear" w:color="auto" w:fill="F7F7F7"/>
+            <w:shd w:val="clear" w:color="auto" w:fill="FFFFFF"/>
             <w:vAlign w:val="top"/>
             <w:tcMar>
               <w:top w:w="90" w:type="dxa"/>
@@ -2643,7 +2836,7 @@
         <w:tc>
           <w:tcPr>
             <w:tcW w:w="4900" w:type="dxa"/>
-            <w:shd w:val="clear" w:color="auto" w:fill="F7F7F7"/>
+            <w:shd w:val="clear" w:color="auto" w:fill="FFFFFF"/>
             <w:vAlign w:val="top"/>
             <w:tcMar>
               <w:top w:w="90" w:type="dxa"/>
@@ -2670,7 +2863,7 @@
         <w:tc>
           <w:tcPr>
             <w:tcW w:w="2460" w:type="dxa"/>
-            <w:shd w:val="clear" w:color="auto" w:fill="F7F7F7"/>
+            <w:shd w:val="clear" w:color="auto" w:fill="FFFFFF"/>
             <w:vAlign w:val="top"/>
             <w:tcMar>
               <w:top w:w="90" w:type="dxa"/>
@@ -2749,7 +2942,7 @@
           <w:sz w:val="22"/>
           <w:szCs w:val="22"/>
         </w:rPr>
-        <w:t xml:space="preserve">Este documento especifica os requisitos funcionais, os requisitos não funcionais, as regras de negócio e os casos de uso do sistema Frila, servindo de referência para o time de desenvolvimento, para os testes e para a validação com as partes interessadas. O posicionamento de mercado, as personas e a justificativa de cada escolha estão no Documento de Visão v1.1.0, que este documento complementa e não repete.</w:t>
+        <w:t xml:space="preserve">Este documento especifica os requisitos funcionais, os requisitos não funcionais, as regras de negócio e os casos de uso do sistema Frila, servindo de referência para o time de desenvolvimento, para os testes e para a validação com as partes interessadas. O posicionamento de mercado, as personas e a justificativa de cada escolha estão no Documento de Visão v1.2.0, que este documento complementa e não repete.</w:t>
       </w:r>
     </w:p>
     <w:p>
@@ -2962,7 +3155,7 @@
                 <w:sz w:val="20"/>
                 <w:szCs w:val="20"/>
               </w:rPr>
-              <w:t xml:space="preserve">Dois aplicativos, o do Profissional e o do Estabelecimento, cada um em iOS nativo (Swift e SwiftUI), Android nativo (Kotlin) e versão web. O Painel é uma feature da versão web do app do estabelecimento, usada pelo gestor. O backend é o Supabase, onde ficam as regras que precisam valer igual nos três clientes. Para a entrega na loja em 13/11, o iOS é o mínimo; Android e web são a meta.</w:t>
+              <w:t xml:space="preserve">Um aplicativo só, com dois perfis, o do profissional e o do contratante, que publica pelo estabelecimento, em iOS nativo (Swift e SwiftUI), Android nativo (Kotlin) e versão web. Cada conta tem um perfil só (RN25). O Painel é uma feature da versão web, no perfil de contratante, usada pelo gestor. O backend é o Supabase, onde ficam as regras que precisam valer igual nos três clientes. Para a entrega na loja em 13/11, o iOS é o mínimo; Android e web são a meta.</w:t>
             </w:r>
           </w:p>
         </w:tc>
@@ -5195,6 +5388,89 @@
           </w:p>
         </w:tc>
       </w:tr>
+      <w:tr>
+        <w:tc>
+          <w:tcPr>
+            <w:tcW w:w="750" w:type="dxa"/>
+            <w:shd w:val="clear" w:color="auto" w:fill="F7F7F7"/>
+            <w:vAlign w:val="top"/>
+            <w:tcMar>
+              <w:top w:w="90" w:type="dxa"/>
+              <w:left w:w="120" w:type="dxa"/>
+              <w:bottom w:w="90" w:type="dxa"/>
+              <w:right w:w="120" w:type="dxa"/>
+            </w:tcMar>
+          </w:tcPr>
+          <w:p>
+            <w:pPr>
+              <w:spacing w:before="0" w:after="0" w:line="264" w:lineRule="auto"/>
+            </w:pPr>
+            <w:r>
+              <w:rPr>
+                <w:rFonts w:ascii="SF Pro Display" w:hAnsi="SF Pro Display" w:cs="SF Pro Display"/>
+                <w:color w:val="1A1A1A"/>
+                <w:sz w:val="20"/>
+                <w:szCs w:val="20"/>
+              </w:rPr>
+              <w:t xml:space="preserve">RN25</w:t>
+            </w:r>
+          </w:p>
+        </w:tc>
+        <w:tc>
+          <w:tcPr>
+            <w:tcW w:w="4400" w:type="dxa"/>
+            <w:shd w:val="clear" w:color="auto" w:fill="F7F7F7"/>
+            <w:vAlign w:val="top"/>
+            <w:tcMar>
+              <w:top w:w="90" w:type="dxa"/>
+              <w:left w:w="120" w:type="dxa"/>
+              <w:bottom w:w="90" w:type="dxa"/>
+              <w:right w:w="120" w:type="dxa"/>
+            </w:tcMar>
+          </w:tcPr>
+          <w:p>
+            <w:pPr>
+              <w:spacing w:before="0" w:after="0" w:line="264" w:lineRule="auto"/>
+            </w:pPr>
+            <w:r>
+              <w:rPr>
+                <w:rFonts w:ascii="SF Pro Display" w:hAnsi="SF Pro Display" w:cs="SF Pro Display"/>
+                <w:color w:val="1A1A1A"/>
+                <w:sz w:val="20"/>
+                <w:szCs w:val="20"/>
+              </w:rPr>
+              <w:t xml:space="preserve">Cada conta DEVE ter um único perfil, profissional ou contratante, escolhido no cadastro e sem troca depois. Para usar o outro perfil, a pessoa cria outra conta, com outro e-mail; o mesmo telefone pode aparecer nas duas.</w:t>
+            </w:r>
+          </w:p>
+        </w:tc>
+        <w:tc>
+          <w:tcPr>
+            <w:tcW w:w="4210" w:type="dxa"/>
+            <w:shd w:val="clear" w:color="auto" w:fill="F7F7F7"/>
+            <w:vAlign w:val="top"/>
+            <w:tcMar>
+              <w:top w:w="90" w:type="dxa"/>
+              <w:left w:w="120" w:type="dxa"/>
+              <w:bottom w:w="90" w:type="dxa"/>
+              <w:right w:w="120" w:type="dxa"/>
+            </w:tcMar>
+          </w:tcPr>
+          <w:p>
+            <w:pPr>
+              <w:spacing w:before="0" w:after="0" w:line="264" w:lineRule="auto"/>
+            </w:pPr>
+            <w:r>
+              <w:rPr>
+                <w:rFonts w:ascii="SF Pro Display" w:hAnsi="SF Pro Display" w:cs="SF Pro Display"/>
+                <w:color w:val="1A1A1A"/>
+                <w:sz w:val="20"/>
+                <w:szCs w:val="20"/>
+              </w:rPr>
+              <w:t xml:space="preserve">Mantém separados a reputação, o histórico e as permissões de cada lado, e cada conta vê só as telas do próprio perfil. A regra é garantida no banco, que grava o perfil no cadastro e recusa a troca.</w:t>
+            </w:r>
+          </w:p>
+        </w:tc>
+      </w:tr>
     </w:tbl>
     <w:p>
       <w:pPr>
@@ -5425,7 +5701,7 @@
                 <w:sz w:val="20"/>
                 <w:szCs w:val="20"/>
               </w:rPr>
-              <w:t xml:space="preserve">O sistema deve permitir que o profissional se cadastre e autentique com dados mínimos: nome, telefone, e-mail e confirmação de maioridade.</w:t>
+              <w:t xml:space="preserve">O sistema deve permitir que o profissional se cadastre e entre com um código de uso único enviado ao e-mail, sem senha e sem SMS, informando dados mínimos: nome, telefone com WhatsApp e confirmação de maioridade.</w:t>
             </w:r>
           </w:p>
         </w:tc>
@@ -5479,7 +5755,7 @@
                 <w:sz w:val="20"/>
                 <w:szCs w:val="20"/>
               </w:rPr>
-              <w:t xml:space="preserve">Um profissional conclui o cadastro e fica apto a receber notificações de vaga sem enviar documento.</w:t>
+              <w:t xml:space="preserve">Um profissional conclui o cadastro e fica apto a receber notificações de vaga sem enviar documento; o telefone é obrigatório, porque é o contato do turno (RN10), e o app confere só o formato, sem verificação por SMS.</w:t>
             </w:r>
           </w:p>
         </w:tc>
@@ -5589,7 +5865,7 @@
                 <w:sz w:val="20"/>
                 <w:szCs w:val="20"/>
               </w:rPr>
-              <w:t xml:space="preserve">Um contratante conclui o cadastro e publica a primeira vaga na mesma sessão, sem onboarding assistido.</w:t>
+              <w:t xml:space="preserve">Um contratante conclui o cadastro e publica a primeira vaga na mesma sessão, sem onboarding assistido; a conta dele é criada como em RF01, com código no e-mail, e tem o perfil de contratante (RN25).</w:t>
             </w:r>
           </w:p>
         </w:tc>
@@ -5645,7 +5921,7 @@
                 <w:sz w:val="20"/>
                 <w:szCs w:val="20"/>
               </w:rPr>
-              <w:t xml:space="preserve">O sistema deve permitir que o profissional declare suas funções, seu ponto base e sua disponibilidade por dia e faixa de horário, e marque que está disponível agora.</w:t>
+              <w:t xml:space="preserve">O sistema deve permitir que o profissional declare suas funções, seu ponto base e sua disponibilidade por dia e faixa de horário.</w:t>
             </w:r>
           </w:p>
         </w:tc>
@@ -7679,7 +7955,7 @@
                 <w:sz w:val="20"/>
                 <w:szCs w:val="20"/>
               </w:rPr>
-              <w:t xml:space="preserve">Um novo usuário é incluído sem compartilhamento de senha; o histórico do estabelecimento permanece ao trocar de responsável.</w:t>
+              <w:t xml:space="preserve">Um novo usuário entra com a própria conta de contratante, sem compartilhar acesso; o histórico do estabelecimento permanece ao trocar de responsável.</w:t>
             </w:r>
           </w:p>
         </w:tc>
@@ -8065,7 +8341,7 @@
                 <w:sz w:val="20"/>
                 <w:szCs w:val="20"/>
               </w:rPr>
-              <w:t xml:space="preserve">O sistema deve permitir que o usuário exporte seus dados pessoais e exclua a conta de dentro do aplicativo, nos dois apps.</w:t>
+              <w:t xml:space="preserve">O sistema deve permitir que o usuário exporte seus dados pessoais e exclua a conta de dentro do aplicativo, nos dois perfis.</w:t>
             </w:r>
           </w:p>
         </w:tc>
@@ -20699,7 +20975,7 @@
                 <w:sz w:val="20"/>
                 <w:szCs w:val="20"/>
               </w:rPr>
-              <w:t xml:space="preserve">1. O gestor abre o Painel na versão web do app do estabelecimento.</w:t>
+              <w:t xml:space="preserve">1. O gestor abre o Painel na versão web do Frila, com a conta de contratante.</w:t>
             </w:r>
             <w:r>
               <w:rPr>
@@ -21749,7 +22025,7 @@
                 <w:sz w:val="20"/>
                 <w:szCs w:val="20"/>
               </w:rPr>
-              <w:t xml:space="preserve">Não existe conta ativa com o mesmo telefone ou e-mail.</w:t>
+              <w:t xml:space="preserve">Não existe conta com o mesmo e-mail. O telefone pode se repetir em outra conta (RN25).</w:t>
             </w:r>
           </w:p>
         </w:tc>
@@ -21805,7 +22081,7 @@
                 <w:sz w:val="20"/>
                 <w:szCs w:val="20"/>
               </w:rPr>
-              <w:t xml:space="preserve">1. O profissional informa nome, telefone e e-mail e confirma ter 18 anos ou mais.</w:t>
+              <w:t xml:space="preserve">1. O profissional informa o e-mail e digita o código de uso único que chega nele. Não há senha nem SMS.</w:t>
             </w:r>
             <w:r>
               <w:rPr>
@@ -21823,7 +22099,7 @@
                 <w:sz w:val="20"/>
                 <w:szCs w:val="20"/>
               </w:rPr>
-              <w:t xml:space="preserve">2. O sistema confirma o telefone por código.</w:t>
+              <w:t xml:space="preserve">2. O profissional escolhe o perfil de profissional, que fica fixo na conta (RN25), informa nome, telefone com WhatsApp e data de nascimento e confirma ter 18 anos ou mais. O sistema confere só o formato do telefone.</w:t>
             </w:r>
             <w:r>
               <w:rPr>
@@ -21877,7 +22153,7 @@
                 <w:sz w:val="20"/>
                 <w:szCs w:val="20"/>
               </w:rPr>
-              <w:t xml:space="preserve">5. A qualquer momento, o profissional altera funções, ponto base ou disponibilidade, ou marca que está disponível agora, e a mudança vale na notificação seguinte, sem novo login.</w:t>
+              <w:t xml:space="preserve">5. A qualquer momento, o profissional altera funções, ponto base ou disponibilidade, e a mudança vale na notificação seguinte, sem novo login.</w:t>
             </w:r>
           </w:p>
         </w:tc>
@@ -21933,7 +22209,25 @@
                 <w:sz w:val="20"/>
                 <w:szCs w:val="20"/>
               </w:rPr>
-              <w:t xml:space="preserve">1a. A pessoa declara ter menos de 18 anos: o cadastro é recusado, e nada além do necessário para registrar a recusa é guardado (RN20).</w:t>
+              <w:t xml:space="preserve">2a. A pessoa declara ter menos de 18 anos: o cadastro é recusado, e nada além do necessário para registrar a recusa é guardado (RN20).</w:t>
+            </w:r>
+            <w:r>
+              <w:rPr>
+                <w:rFonts w:ascii="SF Pro Display" w:hAnsi="SF Pro Display" w:cs="SF Pro Display"/>
+                <w:color w:val="1A1A1A"/>
+                <w:sz w:val="20"/>
+                <w:szCs w:val="20"/>
+              </w:rPr>
+              <w:br/>
+            </w:r>
+            <w:r>
+              <w:rPr>
+                <w:rFonts w:ascii="SF Pro Display" w:hAnsi="SF Pro Display" w:cs="SF Pro Display"/>
+                <w:color w:val="1A1A1A"/>
+                <w:sz w:val="20"/>
+                <w:szCs w:val="20"/>
+              </w:rPr>
+              <w:t xml:space="preserve">2b. A pessoa já tem conta de contratante: para trabalhar em turnos, cria outra conta, com outro e-mail; o telefone pode ser o mesmo (RN25).</w:t>
             </w:r>
             <w:r>
               <w:rPr>
@@ -22099,7 +22393,7 @@
                 <w:sz w:val="20"/>
                 <w:szCs w:val="20"/>
               </w:rPr>
-              <w:t xml:space="preserve">RN01, RN05, RN14, RN15, RN20</w:t>
+              <w:t xml:space="preserve">RN01, RN05, RN14, RN15, RN20, RN25</w:t>
             </w:r>
           </w:p>
         </w:tc>
@@ -22155,7 +22449,7 @@
                 <w:sz w:val="20"/>
                 <w:szCs w:val="20"/>
               </w:rPr>
-              <w:t xml:space="preserve">Dado que tenho 18 anos ou mais, quando informo nome, telefone, e-mail, funções, ponto base e disponibilidade, então fico apto a receber notificações de vaga sem enviar documento e sem pagar nada.</w:t>
+              <w:t xml:space="preserve">Dado que tenho 18 anos ou mais, quando entro com o código enviado ao meu e-mail e informo nome, telefone, funções, ponto base e disponibilidade, então fico apto a receber notificações de vaga sem enviar documento e sem pagar nada.</w:t>
             </w:r>
           </w:p>
         </w:tc>
@@ -22338,7 +22632,7 @@
                 <w:sz w:val="20"/>
                 <w:szCs w:val="20"/>
               </w:rPr>
-              <w:t xml:space="preserve">O responsável tem 18 anos ou mais e uma conta de acesso.</w:t>
+              <w:t xml:space="preserve">O responsável tem 18 anos ou mais e uma conta de contratante (RN25), criada com código no e-mail.</w:t>
             </w:r>
           </w:p>
         </w:tc>
@@ -22448,7 +22742,7 @@
                 <w:sz w:val="20"/>
                 <w:szCs w:val="20"/>
               </w:rPr>
-              <w:t xml:space="preserve">4. O administrador convida outros usuários por telefone ou e-mail e atribui a cada um o papel de administrador ou de operador do estabelecimento.</w:t>
+              <w:t xml:space="preserve">4. O administrador convida outros usuários pelo e-mail e atribui a cada um o papel de administrador ou de operador do estabelecimento.</w:t>
             </w:r>
             <w:r>
               <w:rPr>
@@ -22466,7 +22760,7 @@
                 <w:sz w:val="20"/>
                 <w:szCs w:val="20"/>
               </w:rPr>
-              <w:t xml:space="preserve">5. O convidado aceita com a própria conta, sem compartilhar senha.</w:t>
+              <w:t xml:space="preserve">5. O convidado aceita com a própria conta de contratante, sem compartilhar acesso. Uma conta de profissional não pode aceitar o convite (RN25).</w:t>
             </w:r>
           </w:p>
         </w:tc>
@@ -22670,7 +22964,7 @@
                 <w:sz w:val="20"/>
                 <w:szCs w:val="20"/>
               </w:rPr>
-              <w:t xml:space="preserve">RN15, RN20</w:t>
+              <w:t xml:space="preserve">RN15, RN20, RN25</w:t>
             </w:r>
           </w:p>
         </w:tc>
@@ -22726,7 +23020,7 @@
                 <w:sz w:val="20"/>
                 <w:szCs w:val="20"/>
               </w:rPr>
-              <w:t xml:space="preserve">Dado que cadastrei o estabelecimento, quando convido um gerente como operador, então ele passa a publicar e acompanhar vagas com a própria conta, sem compartilhamento de senha, e o histórico permanece com o estabelecimento se eu sair.</w:t>
+              <w:t xml:space="preserve">Dado que cadastrei o estabelecimento, quando convido um gerente como operador, então ele passa a publicar e acompanhar vagas com a própria conta, sem compartilhar acesso, e o histórico permanece com o estabelecimento se eu sair.</w:t>
             </w:r>
           </w:p>
         </w:tc>
@@ -26294,7 +26588,7 @@
         <w:drawing>
           <wp:inline distT="0" distB="0" distL="0" distR="0">
             <wp:extent cx="5943600" cy="2514600"/>
-            <wp:docPr id="5" name="Imagem 5" descr="Figura 5 — Uma conta de acesso, dois papéis"/>
+            <wp:docPr id="5" name="Imagem 5" descr="Figura 5 — Cada conta com um perfil só (RN25)"/>
             <a:graphic>
               <a:graphicData uri="http://schemas.openxmlformats.org/drawingml/2006/picture">
                 <pic:pic>
@@ -26337,7 +26631,7 @@
           <w:sz w:val="18"/>
           <w:szCs w:val="18"/>
         </w:rPr>
-        <w:t xml:space="preserve">Figura 5 — Uma conta de acesso, dois papéis</w:t>
+        <w:t xml:space="preserve">Figura 5 — Cada conta com um perfil só (RN25)</w:t>
       </w:r>
     </w:p>
     <w:p>
@@ -26653,7 +26947,7 @@
                 <w:sz w:val="20"/>
                 <w:szCs w:val="20"/>
               </w:rPr>
-              <w:t xml:space="preserve">Conta de acesso, comum a todos os perfis. A credencial fica no Supabase Auth, e o id é o mesmo da conta de autenticação.</w:t>
+              <w:t xml:space="preserve">Conta de acesso, com um perfil só, profissional ou contratante (RN25). A entrada é por código no e-mail, a credencial fica no Supabase Auth e o id é o mesmo da conta de autenticação. O e-mail é único; o telefone, não.</w:t>
             </w:r>
           </w:p>
         </w:tc>
@@ -26680,7 +26974,7 @@
                 <w:sz w:val="20"/>
                 <w:szCs w:val="20"/>
               </w:rPr>
-              <w:t xml:space="preserve">id, nome, telefone, email, nascimento, estado, criado_em, anonimizado_em</w:t>
+              <w:t xml:space="preserve">id, perfil, nome, telefone, email, nascimento, estado, criado_em, anonimizado_em</w:t>
             </w:r>
           </w:p>
         </w:tc>
@@ -26707,7 +27001,7 @@
                 <w:sz w:val="20"/>
                 <w:szCs w:val="20"/>
               </w:rPr>
-              <w:t xml:space="preserve">1:1 com Profissional; N:N com Estabelecimento via MembroEstabelecimento</w:t>
+              <w:t xml:space="preserve">1:1 com Profissional, na conta de profissional; N:N com Estabelecimento via MembroEstabelecimento, na conta de contratante</w:t>
             </w:r>
           </w:p>
         </w:tc>
@@ -26790,7 +27084,7 @@
                 <w:sz w:val="20"/>
                 <w:szCs w:val="20"/>
               </w:rPr>
-              <w:t xml:space="preserve">id, usuario_id, ponto_base, disponivel_agora_ate, taxa_comparecimento, turnos_realizados, estado</w:t>
+              <w:t xml:space="preserve">id, usuario_id, ponto_base, taxa_comparecimento, turnos_realizados, estado</w:t>
             </w:r>
           </w:p>
         </w:tc>
@@ -29288,7 +29582,7 @@
                 <w:sz w:val="20"/>
                 <w:szCs w:val="20"/>
               </w:rPr>
-              <w:t xml:space="preserve">id: UUID, funcoes: [Funcao], pontoBase: Coordenada, disponibilidades: [Disponibilidade], disponivelAgoraAte: Date?, taxaComparecimento: Double?</w:t>
+              <w:t xml:space="preserve">id: UUID, funcoes: [Funcao], pontoBase: Coordenada, disponibilidades: [Disponibilidade], taxaComparecimento: Double?</w:t>
             </w:r>
           </w:p>
         </w:tc>
@@ -30471,7 +30765,7 @@
                 <w:sz w:val="20"/>
                 <w:szCs w:val="20"/>
               </w:rPr>
-              <w:t xml:space="preserve">Orquestrar, no app do estabelecimento, as vagas em alerta e a confirmação de check-in manual. O Painel do gestor é web.</w:t>
+              <w:t xml:space="preserve">Orquestrar, no perfil de contratante, as vagas em alerta e a confirmação de check-in manual. O Painel do gestor é web.</w:t>
             </w:r>
           </w:p>
         </w:tc>
@@ -30581,7 +30875,7 @@
                 <w:sz w:val="20"/>
                 <w:szCs w:val="20"/>
               </w:rPr>
-              <w:t xml:space="preserve">Guardar identidade, perfil ativo e permissões.</w:t>
+              <w:t xml:space="preserve">Guardar identidade, o perfil da conta, que é fixo (RN25), e as permissões. O token fica no Keychain, nunca no objeto.</w:t>
             </w:r>
           </w:p>
         </w:tc>
@@ -30608,7 +30902,7 @@
                 <w:sz w:val="20"/>
                 <w:szCs w:val="20"/>
               </w:rPr>
-              <w:t xml:space="preserve">usuario: Usuario, perfilAtivo: Perfil, token: Token</w:t>
+              <w:t xml:space="preserve">usuario: Usuario, perfil: PerfilConta, idCredencial: String</w:t>
             </w:r>
           </w:p>
         </w:tc>
@@ -30635,7 +30929,7 @@
                 <w:sz w:val="20"/>
                 <w:szCs w:val="20"/>
               </w:rPr>
-              <w:t xml:space="preserve">trocarPerfil(_: Perfil): Void, encerrar(): Void</w:t>
+              <w:t xml:space="preserve">encerrar(): Void</w:t>
             </w:r>
           </w:p>
         </w:tc>
@@ -31203,7 +31497,7 @@
                 <w:sz w:val="20"/>
                 <w:szCs w:val="20"/>
               </w:rPr>
-              <w:t xml:space="preserve">Autenticação, acesso às tabelas e chamada das funções RPC do backend</w:t>
+              <w:t xml:space="preserve">Entrada por código no e-mail, acesso às tabelas e chamada das funções RPC do backend</w:t>
             </w:r>
           </w:p>
         </w:tc>
@@ -32551,7 +32845,7 @@
                 <w:sz w:val="20"/>
                 <w:szCs w:val="20"/>
               </w:rPr>
-              <w:t xml:space="preserve">Cadastro e autenticação do profissional</w:t>
+              <w:t xml:space="preserve">Cadastro e entrada do profissional por código no e-mail</w:t>
             </w:r>
           </w:p>
         </w:tc>
@@ -32578,7 +32872,7 @@
                 <w:sz w:val="20"/>
                 <w:szCs w:val="20"/>
               </w:rPr>
-              <w:t xml:space="preserve">RN14, RN15, RN20</w:t>
+              <w:t xml:space="preserve">RN14, RN15, RN20, RN25</w:t>
             </w:r>
           </w:p>
         </w:tc>
@@ -32715,7 +33009,7 @@
                 <w:sz w:val="20"/>
                 <w:szCs w:val="20"/>
               </w:rPr>
-              <w:t xml:space="preserve">RN15, RN20</w:t>
+              <w:t xml:space="preserve">RN15, RN20, RN25</w:t>
             </w:r>
           </w:p>
         </w:tc>
@@ -35318,7 +35612,7 @@
                 <w:sz w:val="20"/>
                 <w:szCs w:val="20"/>
               </w:rPr>
-              <w:t xml:space="preserve">RN15</w:t>
+              <w:t xml:space="preserve">RN15, RN25</w:t>
             </w:r>
           </w:p>
         </w:tc>

</xml_diff>

<commit_message>
Aplica as decisões de 30/09 às notas de arquitetura e aos documentos do Frila
Fraude e documento falso pelo motivo "outro" da denúncia; o bloqueio também
vai esconder o perfil público (ainda a implementar); contrato 0.2.27; estado do
projeto no LEIA-PRIMEIRO e no README; cópias de Documentos de Produto e .md
derivados regerados.

Co-Authored-By: Claude Opus 5.5 <noreply@anthropic.com>
</commit_message>
<xml_diff>
--- a/doc-harness/01 - CBL/Desafios/C18/Documentos de Produto/Frila_Documento_de_Requisitos.docx
+++ b/doc-harness/01 - CBL/Desafios/C18/Documentos de Produto/Frila_Documento_de_Requisitos.docx
@@ -1037,7 +1037,7 @@
                 <w:sz w:val="20"/>
                 <w:szCs w:val="20"/>
               </w:rPr>
-              <w:t xml:space="preserve">Revisão de consistência para a entrega parcial de 02/10, contra o contrato da API 0.2.26, as decisões de produto de 28/09, o Escopo do MVP e o código: v1.0 só iOS, com Android e web na v1.2; região administrativa na vaga e no estabelecimento (RN02, RF02, RF04); cancelamento que dá à vaga uma posição nova (RN12, RF14, UC08); suspensão com cancelamento em cascata (RN13); check-in de 60 minutos antes até o fim, check-out sem limite de distância e falta para quem termina o turno sem check-in (RN22, RF13, UC05); maioridade pela data de nascimento e aceite dos termos (RF01, UC09); lembrete sem telefone nem endereço na tela de bloqueio e “estou a caminho” na v1.1 (RF12); um voto por lado na avaliação (RF15, UC06); taxa de comparecimento só do profissional (RF16); equipe de confiança só pelo administrador e com turno cumprido (RF18, UC11); exclusão sem falta (RF25, UC16); vaga ocultada pela Equipe Frila (RF26, UC17); entidades, classes, pacotes e estrutura de pastas conferidos com o banco e o app; regras vinculadas alinhadas ao Diagrama de Casos de Uso; contrato em api/openapi.yaml.</w:t>
+              <w:t xml:space="preserve">Revisão de consistência para a entrega parcial de 02/10, contra o contrato da API 0.2.27, as decisões de produto de 28/09, o Escopo do MVP e o código: v1.0 só iOS, com Android e web na v1.2; região administrativa na vaga e no estabelecimento (RN02, RF02, RF04); cancelamento que dá à vaga uma posição nova (RN12, RF14, UC08); suspensão com cancelamento em cascata (RN13); check-in de 60 minutos antes até o fim, check-out sem limite de distância e falta para quem termina o turno sem check-in (RN22, RF13, UC05); maioridade pela data de nascimento e aceite dos termos (RF01, UC09); lembrete sem telefone nem endereço na tela de bloqueio e “estou a caminho” na v1.1 (RF12); um voto por lado na avaliação (RF15, UC06); taxa de comparecimento só do profissional (RF16); equipe de confiança só pelo administrador e com turno cumprido (RF18, UC11); exclusão sem falta (RF25, UC16); vaga ocultada pela Equipe Frila (RF26, UC17); decisões de 30/09: o bloqueio também esconde o perfil (RF26, UC17) e fraude e documento falso chegam pelo motivo “outro” da denúncia (RN13); entidades, classes, pacotes e estrutura de pastas conferidos com o banco e o app; regras vinculadas alinhadas ao Diagrama de Casos de Uso; contrato em api/openapi.yaml.</w:t>
             </w:r>
           </w:p>
         </w:tc>
@@ -3064,7 +3064,7 @@
           <w:sz w:val="22"/>
           <w:szCs w:val="22"/>
         </w:rPr>
-        <w:t xml:space="preserve">Uma ressalva de leitura: o Frila ainda não passou por validação de campo. Desde 22/09 há código, o backend no Supabase e o app iOS, com builds internos no TestFlight, e o comportamento da API está no contrato (api/openapi.yaml, versão 0.2.26). As regras e os requisitos aqui derivam de evidência pública sobre o mercado e das falhas observadas nos concorrentes, mas as premissas de comportamento do usuário no Distrito Federal permanecem hipóteses, marcadas com [H]. Requisitos que dependem diretamente de uma hipótese trazem a marca no próprio texto, para que a revisão posterior saiba onde mexer.</w:t>
+        <w:t xml:space="preserve">Uma ressalva de leitura: o Frila ainda não passou por validação de campo. Desde 22/09 há código, o backend no Supabase e o app iOS, com builds internos no TestFlight, e o comportamento da API está no contrato (api/openapi.yaml, versão 0.2.27). As regras e os requisitos aqui derivam de evidência pública sobre o mercado e das falhas observadas nos concorrentes, mas as premissas de comportamento do usuário no Distrito Federal permanecem hipóteses, marcadas com [H]. Requisitos que dependem diretamente de uma hipótese trazem a marca no próprio texto, para que a revisão posterior saiba onde mexer.</w:t>
       </w:r>
     </w:p>
     <w:p>
@@ -4549,7 +4549,7 @@
                 <w:sz w:val="20"/>
                 <w:szCs w:val="20"/>
               </w:rPr>
-              <w:t xml:space="preserve">O sistema NÃO DEVE suspender ou bloquear um perfil sem motivo registrado e sem canal de contestação com resposta em até 5 dias úteis. A suspensão só acontece por denúncia grave confirmada (assédio, fraude ou documento falso) e cancela na hora os turnos futuros da conta, com registro, aviso à contraparte e reabertura das posições; cancelamento nunca suspende, só afeta a taxa de comparecimento.</w:t>
+              <w:t xml:space="preserve">O sistema NÃO DEVE suspender ou bloquear um perfil sem motivo registrado e sem canal de contestação com resposta em até 5 dias úteis. A suspensão só acontece por denúncia grave confirmada (assédio, fraude ou documento falso) e cancela na hora os turnos futuros da conta, com registro, aviso à contraparte e reabertura das posições; cancelamento nunca suspende, só afeta a taxa de comparecimento. Fraude e documento falso chegam pelo motivo “outro” da denúncia, com o relato, e a Equipe Frila apura.</w:t>
             </w:r>
           </w:p>
         </w:tc>
@@ -8610,7 +8610,7 @@
                 <w:sz w:val="20"/>
                 <w:szCs w:val="20"/>
               </w:rPr>
-              <w:t xml:space="preserve">A denúncia registra o motivo (assédio, discriminação, risco à segurança ou outro) e chega à Equipe Frila, com resposta em até 5 dias úteis; o bloqueio é imediato e impede que as partes voltem a se cruzar em notificações, listas e candidaturas; a Equipe Frila pode ocultar vaga com conteúdo impróprio até revisá-la, sem cancelar turnos confirmados, e o estabelecimento vê que ela foi ocultada.</w:t>
+              <w:t xml:space="preserve">A denúncia registra o motivo (assédio, discriminação, risco à segurança ou outro) e chega à Equipe Frila, com resposta em até 5 dias úteis; o bloqueio é imediato e impede que as partes voltem a se cruzar em notificações, listas, candidaturas e no perfil público (decisão de 30/09; o perfil ainda aparece e passa a ser escondido numa próxima versão do contrato); a Equipe Frila pode ocultar vaga com conteúdo impróprio até revisá-la, sem cancelar turnos confirmados, e o estabelecimento vê que ela foi ocultada.</w:t>
             </w:r>
           </w:p>
         </w:tc>
@@ -26558,7 +26558,7 @@
                 <w:sz w:val="20"/>
                 <w:szCs w:val="20"/>
               </w:rPr>
-              <w:t xml:space="preserve">4a. Com o bloqueio, as partes não voltam a se cruzar: o profissional não recebe notificação nem vê vagas do estabelecimento, e o estabelecimento não recebe candidatura dele.</w:t>
+              <w:t xml:space="preserve">4a. Com o bloqueio, as partes não voltam a se cruzar: o profissional não recebe notificação nem vê vagas do estabelecimento, o estabelecimento não recebe candidatura dele, e o perfil de um deixa de aparecer para o outro (decisão de 30/09, a implementar).</w:t>
             </w:r>
             <w:r>
               <w:rPr>
@@ -26576,7 +26576,7 @@
                 <w:sz w:val="20"/>
                 <w:szCs w:val="20"/>
               </w:rPr>
-              <w:t xml:space="preserve">5a. A denúncia grave é confirmada (assédio, fraude ou documento falso): o perfil denunciado é suspenso, com motivo registrado e direito de contestar (UC15); os turnos futuros dele são cancelados, a contraparte é avisada e as posições são reabertas (RN13).</w:t>
+              <w:t xml:space="preserve">5a. A denúncia grave é confirmada (assédio, ou fraude e documento falso, que chegam pelo motivo “outro”): o perfil denunciado é suspenso, com motivo registrado e direito de contestar (UC15); os turnos futuros dele são cancelados, a contraparte é avisada e as posições são reabertas (RN13).</w:t>
             </w:r>
             <w:r>
               <w:rPr>
@@ -26780,7 +26780,7 @@
                 <w:sz w:val="20"/>
                 <w:szCs w:val="20"/>
               </w:rPr>
-              <w:t xml:space="preserve">Dado que sofri assédio num turno, quando denuncio e bloqueio a outra parte, então a denúncia chega à Equipe Frila com prazo de resposta de até 5 dias úteis, e a outra parte deixa de aparecer para mim, e eu para ela, em notificações, listas e candidaturas, na hora. É o mecanismo que a diretriz 1.2 da App Store exige.</w:t>
+              <w:t xml:space="preserve">Dado que sofri assédio num turno, quando denuncio e bloqueio a outra parte, então a denúncia chega à Equipe Frila com prazo de resposta de até 5 dias úteis, e a outra parte deixa de aparecer para mim, e eu para ela, em notificações, listas, candidaturas e no perfil, na hora. É o mecanismo que a diretriz 1.2 da App Store exige.</w:t>
             </w:r>
           </w:p>
         </w:tc>
@@ -31304,7 +31304,7 @@
           <w:sz w:val="22"/>
           <w:szCs w:val="22"/>
         </w:rPr>
-        <w:t xml:space="preserve">O contrato entre os apps e o backend foi escrito antes do código (decisão B16) e está em api/openapi.yaml, no repositório frila-docs (OpenAPI 3.1; primeira versão em 22/09/2026, versão 0.2.26 em 30/09/2026). Toda mudança passa primeiro por ele, depois pelo backend e só então chega ao app. Cada operação com regra de negócio é uma função RPC do Supabase; as recusas de regra voltam com código estável, como posicao_ja_preenchida (409) e inelegivel (422), e reenviar a mesma escrita devolve o mesmo resultado.</w:t>
+        <w:t xml:space="preserve">O contrato entre os apps e o backend foi escrito antes do código (decisão B16) e está em api/openapi.yaml, no repositório frila-docs (OpenAPI 3.1; primeira versão em 22/09/2026, versão 0.2.27 em 30/09/2026). Toda mudança passa primeiro por ele, depois pelo backend e só então chega ao app. Cada operação com regra de negócio é uma função RPC do Supabase; as recusas de regra voltam com código estável, como posicao_ja_preenchida (409) e inelegivel (422), e reenviar a mesma escrita devolve o mesmo resultado.</w:t>
       </w:r>
     </w:p>
     <w:p>

</xml_diff>